<commit_message>
edge betweenness and new analysis data in word & excel
</commit_message>
<xml_diff>
--- a/Analysis of Betweenness.docx
+++ b/Analysis of Betweenness.docx
@@ -401,21 +401,7 @@
         <w:rPr>
           <w:lang w:val="en-GB"/>
         </w:rPr>
-        <w:t xml:space="preserve">2023:  no imports from </w:t>
-      </w:r>
-      <w:proofErr w:type="gramStart"/>
-      <w:r>
-        <w:rPr>
-          <w:lang w:val="en-GB"/>
-        </w:rPr>
-        <w:t>RU  -</w:t>
-      </w:r>
-      <w:proofErr w:type="gramEnd"/>
-      <w:r>
-        <w:rPr>
-          <w:lang w:val="en-GB"/>
-        </w:rPr>
-        <w:t xml:space="preserve"> best importers: </w:t>
+        <w:t xml:space="preserve">2023:  no imports from RU - best importers: </w:t>
       </w:r>
     </w:p>
     <w:p>
@@ -665,20 +651,24 @@
           <w:lang w:val="en-GB"/>
         </w:rPr>
       </w:pPr>
-      <w:proofErr w:type="spellStart"/>
       <w:r>
         <w:rPr>
           <w:lang w:val="en-GB"/>
         </w:rPr>
         <w:lastRenderedPageBreak/>
-        <w:t>Betweeness</w:t>
-      </w:r>
-      <w:proofErr w:type="spellEnd"/>
-      <w:r>
-        <w:rPr>
-          <w:lang w:val="en-GB"/>
-        </w:rPr>
-        <w:t xml:space="preserve"> Shift: </w:t>
+        <w:t>Betwee</w:t>
+      </w:r>
+      <w:r>
+        <w:rPr>
+          <w:lang w:val="en-GB"/>
+        </w:rPr>
+        <w:t>n</w:t>
+      </w:r>
+      <w:r>
+        <w:rPr>
+          <w:lang w:val="en-GB"/>
+        </w:rPr>
+        <w:t xml:space="preserve">ness Shift: </w:t>
       </w:r>
     </w:p>
     <w:tbl>
@@ -10590,6 +10580,1014 @@
           <w:lang w:val="en-GB"/>
         </w:rPr>
       </w:pPr>
+    </w:p>
+    <w:p>
+      <w:pPr>
+        <w:rPr>
+          <w:lang w:val="en-GB"/>
+        </w:rPr>
+      </w:pPr>
+    </w:p>
+    <w:p>
+      <w:pPr>
+        <w:rPr>
+          <w:lang w:val="en-GB"/>
+        </w:rPr>
+      </w:pPr>
+    </w:p>
+    <w:p>
+      <w:pPr>
+        <w:rPr>
+          <w:lang w:val="en-GB"/>
+        </w:rPr>
+      </w:pPr>
+    </w:p>
+    <w:p>
+      <w:pPr>
+        <w:rPr>
+          <w:lang w:val="en-GB"/>
+        </w:rPr>
+      </w:pPr>
+    </w:p>
+    <w:p>
+      <w:pPr>
+        <w:rPr>
+          <w:lang w:val="en-GB"/>
+        </w:rPr>
+      </w:pPr>
+    </w:p>
+    <w:p>
+      <w:pPr>
+        <w:rPr>
+          <w:lang w:val="en-GB"/>
+        </w:rPr>
+      </w:pPr>
+    </w:p>
+    <w:p>
+      <w:pPr>
+        <w:rPr>
+          <w:lang w:val="en-GB"/>
+        </w:rPr>
+      </w:pPr>
+      <w:r>
+        <w:rPr>
+          <w:lang w:val="en-GB"/>
+        </w:rPr>
+        <w:lastRenderedPageBreak/>
+        <w:t>Edge Betweenness -&gt; most important connections in between 2 Hubs</w:t>
+      </w:r>
+    </w:p>
+    <w:p>
+      <w:pPr>
+        <w:rPr>
+          <w:b/>
+          <w:bCs/>
+          <w:lang w:val="en-GB"/>
+        </w:rPr>
+      </w:pPr>
+      <w:r>
+        <w:rPr>
+          <w:b/>
+          <w:bCs/>
+          <w:lang w:val="en-GB"/>
+        </w:rPr>
+        <w:t xml:space="preserve">2019: </w:t>
+      </w:r>
+    </w:p>
+    <w:p>
+      <w:pPr>
+        <w:spacing w:line="240" w:lineRule="auto"/>
+        <w:rPr>
+          <w:lang w:val="en-GB"/>
+        </w:rPr>
+      </w:pPr>
+      <w:r>
+        <w:rPr>
+          <w:lang w:val="en-GB"/>
+        </w:rPr>
+        <w:t xml:space="preserve">        </w:t>
+      </w:r>
+      <w:r>
+        <w:rPr>
+          <w:lang w:val="en-GB"/>
+        </w:rPr>
+        <w:t xml:space="preserve">PL -&gt; SK         |     0.100806 |       3.24 TWh </w:t>
+      </w:r>
+    </w:p>
+    <w:p>
+      <w:pPr>
+        <w:spacing w:line="240" w:lineRule="auto"/>
+        <w:rPr>
+          <w:lang w:val="en-GB"/>
+        </w:rPr>
+      </w:pPr>
+      <w:r>
+        <w:rPr>
+          <w:lang w:val="en-GB"/>
+        </w:rPr>
+        <w:t xml:space="preserve">        SK -&gt; HU         |     0.094560 |       8.75 TWh </w:t>
+      </w:r>
+    </w:p>
+    <w:p>
+      <w:pPr>
+        <w:spacing w:line="240" w:lineRule="auto"/>
+        <w:rPr>
+          <w:lang w:val="en-GB"/>
+        </w:rPr>
+      </w:pPr>
+      <w:r>
+        <w:rPr>
+          <w:lang w:val="en-GB"/>
+        </w:rPr>
+        <w:t xml:space="preserve">        HU -&gt; RS         |     0.080408 |       0.76 TWh </w:t>
+      </w:r>
+    </w:p>
+    <w:p>
+      <w:pPr>
+        <w:spacing w:line="240" w:lineRule="auto"/>
+        <w:rPr>
+          <w:lang w:val="en-GB"/>
+        </w:rPr>
+      </w:pPr>
+      <w:r>
+        <w:rPr>
+          <w:lang w:val="en-GB"/>
+        </w:rPr>
+        <w:t xml:space="preserve">        LT -&gt; PL         |     0.055556 |       2.28 TWh </w:t>
+      </w:r>
+    </w:p>
+    <w:p>
+      <w:pPr>
+        <w:spacing w:line="240" w:lineRule="auto"/>
+        <w:rPr>
+          <w:lang w:val="en-GB"/>
+        </w:rPr>
+      </w:pPr>
+      <w:r>
+        <w:rPr>
+          <w:lang w:val="en-GB"/>
+        </w:rPr>
+        <w:t xml:space="preserve">        HR -&gt; SI         |     0.053571 |       2.28 TWh </w:t>
+      </w:r>
+    </w:p>
+    <w:p>
+      <w:pPr>
+        <w:spacing w:line="240" w:lineRule="auto"/>
+        <w:rPr>
+          <w:lang w:val="en-GB"/>
+        </w:rPr>
+      </w:pPr>
+      <w:r>
+        <w:rPr>
+          <w:lang w:val="en-GB"/>
+        </w:rPr>
+        <w:t xml:space="preserve">        RS -&gt; BG         |     0.042685 |       0.15 TWh </w:t>
+      </w:r>
+    </w:p>
+    <w:p>
+      <w:pPr>
+        <w:spacing w:line="240" w:lineRule="auto"/>
+        <w:rPr>
+          <w:lang w:val="en-GB"/>
+        </w:rPr>
+      </w:pPr>
+      <w:r>
+        <w:rPr>
+          <w:lang w:val="en-GB"/>
+        </w:rPr>
+        <w:t xml:space="preserve">        RS -&gt; HR         |     0.042328 |       0.82 TWh </w:t>
+      </w:r>
+    </w:p>
+    <w:p>
+      <w:pPr>
+        <w:spacing w:line="240" w:lineRule="auto"/>
+        <w:rPr>
+          <w:lang w:val="en-GB"/>
+        </w:rPr>
+      </w:pPr>
+      <w:r>
+        <w:rPr>
+          <w:lang w:val="en-GB"/>
+        </w:rPr>
+        <w:t xml:space="preserve">        </w:t>
+      </w:r>
+      <w:r>
+        <w:rPr>
+          <w:highlight w:val="green"/>
+          <w:lang w:val="en-GB"/>
+        </w:rPr>
+        <w:t>SK -&gt; UA         |     0.041782 |       2.94 TWh</w:t>
+      </w:r>
+    </w:p>
+    <w:p>
+      <w:pPr>
+        <w:rPr>
+          <w:b/>
+          <w:bCs/>
+          <w:lang w:val="en-GB"/>
+        </w:rPr>
+      </w:pPr>
+      <w:r>
+        <w:rPr>
+          <w:b/>
+          <w:bCs/>
+          <w:lang w:val="en-GB"/>
+        </w:rPr>
+        <w:t>2020:</w:t>
+      </w:r>
+    </w:p>
+    <w:p>
+      <w:pPr>
+        <w:spacing w:line="240" w:lineRule="auto"/>
+        <w:rPr>
+          <w:lang w:val="en-GB"/>
+        </w:rPr>
+      </w:pPr>
+      <w:r>
+        <w:rPr>
+          <w:lang w:val="en-GB"/>
+        </w:rPr>
+        <w:t xml:space="preserve">        </w:t>
+      </w:r>
+      <w:r>
+        <w:rPr>
+          <w:lang w:val="en-GB"/>
+        </w:rPr>
+        <w:t>PL -&gt; SK         |     0.182143 |       3.15 TWh</w:t>
+      </w:r>
+    </w:p>
+    <w:p>
+      <w:pPr>
+        <w:spacing w:line="240" w:lineRule="auto"/>
+        <w:rPr>
+          <w:lang w:val="en-GB"/>
+        </w:rPr>
+      </w:pPr>
+      <w:r>
+        <w:rPr>
+          <w:lang w:val="en-GB"/>
+        </w:rPr>
+        <w:t xml:space="preserve">        SK -&gt; HU         |     0.146268 |       9.26 TWh</w:t>
+      </w:r>
+    </w:p>
+    <w:p>
+      <w:pPr>
+        <w:spacing w:line="240" w:lineRule="auto"/>
+        <w:rPr>
+          <w:lang w:val="en-GB"/>
+        </w:rPr>
+      </w:pPr>
+      <w:r>
+        <w:rPr>
+          <w:lang w:val="en-GB"/>
+        </w:rPr>
+        <w:t xml:space="preserve">        HU -&gt; UA         |     0.137931 |       0.13 TWh</w:t>
+      </w:r>
+    </w:p>
+    <w:p>
+      <w:pPr>
+        <w:spacing w:line="240" w:lineRule="auto"/>
+        <w:rPr>
+          <w:lang w:val="en-GB"/>
+        </w:rPr>
+      </w:pPr>
+      <w:r>
+        <w:rPr>
+          <w:lang w:val="en-GB"/>
+        </w:rPr>
+        <w:t xml:space="preserve">        HU -&gt; RS         |     0.122903 |       0.95 TWh</w:t>
+      </w:r>
+    </w:p>
+    <w:p>
+      <w:pPr>
+        <w:spacing w:line="240" w:lineRule="auto"/>
+        <w:rPr>
+          <w:lang w:val="en-GB"/>
+        </w:rPr>
+      </w:pPr>
+      <w:r>
+        <w:rPr>
+          <w:lang w:val="en-GB"/>
+        </w:rPr>
+        <w:t xml:space="preserve">        </w:t>
+      </w:r>
+      <w:r>
+        <w:rPr>
+          <w:highlight w:val="green"/>
+          <w:lang w:val="en-GB"/>
+        </w:rPr>
+        <w:t>UA -&gt; PL         |     0.111453 |       1.48 TWh</w:t>
+      </w:r>
+    </w:p>
+    <w:p>
+      <w:pPr>
+        <w:spacing w:line="240" w:lineRule="auto"/>
+        <w:rPr>
+          <w:lang w:val="en-GB"/>
+        </w:rPr>
+      </w:pPr>
+      <w:r>
+        <w:rPr>
+          <w:lang w:val="en-GB"/>
+        </w:rPr>
+        <w:t xml:space="preserve">        RS -&gt; HU         |     0.103448 |       0.50 TWh</w:t>
+      </w:r>
+    </w:p>
+    <w:p>
+      <w:pPr>
+        <w:spacing w:line="240" w:lineRule="auto"/>
+        <w:rPr>
+          <w:lang w:val="en-GB"/>
+        </w:rPr>
+      </w:pPr>
+      <w:r>
+        <w:rPr>
+          <w:lang w:val="en-GB"/>
+        </w:rPr>
+        <w:t xml:space="preserve">        PL -&gt; CZ         |     0.095443 |       2.85 TWh</w:t>
+      </w:r>
+    </w:p>
+    <w:p>
+      <w:pPr>
+        <w:spacing w:line="240" w:lineRule="auto"/>
+        <w:rPr>
+          <w:lang w:val="en-GB"/>
+        </w:rPr>
+      </w:pPr>
+      <w:r>
+        <w:rPr>
+          <w:lang w:val="en-GB"/>
+        </w:rPr>
+        <w:t xml:space="preserve">        AL -&gt; RS         |     0.094212 |       0.29 TWh</w:t>
+      </w:r>
+    </w:p>
+    <w:p>
+      <w:pPr>
+        <w:rPr>
+          <w:b/>
+          <w:bCs/>
+          <w:lang w:val="en-GB"/>
+        </w:rPr>
+      </w:pPr>
+      <w:r>
+        <w:rPr>
+          <w:b/>
+          <w:bCs/>
+          <w:lang w:val="en-GB"/>
+        </w:rPr>
+        <w:t>2021:</w:t>
+      </w:r>
+    </w:p>
+    <w:p>
+      <w:pPr>
+        <w:spacing w:line="240" w:lineRule="auto"/>
+        <w:rPr>
+          <w:lang w:val="en-GB"/>
+        </w:rPr>
+      </w:pPr>
+      <w:r>
+        <w:rPr>
+          <w:lang w:val="en-GB"/>
+        </w:rPr>
+        <w:t xml:space="preserve">        </w:t>
+      </w:r>
+      <w:r>
+        <w:rPr>
+          <w:highlight w:val="green"/>
+          <w:lang w:val="en-GB"/>
+        </w:rPr>
+        <w:t>RO -&gt; UA         |     0.183908 |       0.39 TWh</w:t>
+      </w:r>
+      <w:r>
+        <w:rPr>
+          <w:lang w:val="en-GB"/>
+        </w:rPr>
+        <w:t xml:space="preserve"> </w:t>
+      </w:r>
+    </w:p>
+    <w:p>
+      <w:pPr>
+        <w:spacing w:line="240" w:lineRule="auto"/>
+        <w:rPr>
+          <w:lang w:val="en-GB"/>
+        </w:rPr>
+      </w:pPr>
+      <w:r>
+        <w:rPr>
+          <w:lang w:val="en-GB"/>
+        </w:rPr>
+        <w:t xml:space="preserve">        PL -&gt; SK         |     0.132329 |       4.62 TWh</w:t>
+      </w:r>
+    </w:p>
+    <w:p>
+      <w:pPr>
+        <w:spacing w:line="240" w:lineRule="auto"/>
+        <w:rPr>
+          <w:lang w:val="en-GB"/>
+        </w:rPr>
+      </w:pPr>
+      <w:r>
+        <w:rPr>
+          <w:lang w:val="en-GB"/>
+        </w:rPr>
+        <w:t xml:space="preserve">        SK -&gt; HU         |     0.111048 |      10.73 TWh</w:t>
+      </w:r>
+    </w:p>
+    <w:p>
+      <w:pPr>
+        <w:spacing w:line="240" w:lineRule="auto"/>
+        <w:rPr>
+          <w:lang w:val="en-GB"/>
+        </w:rPr>
+      </w:pPr>
+      <w:r>
+        <w:rPr>
+          <w:lang w:val="en-GB"/>
+        </w:rPr>
+        <w:t xml:space="preserve">        RS -&gt; RO         |     0.104406 |       0.52 TWh</w:t>
+      </w:r>
+    </w:p>
+    <w:p>
+      <w:pPr>
+        <w:spacing w:line="240" w:lineRule="auto"/>
+        <w:rPr>
+          <w:lang w:val="en-GB"/>
+        </w:rPr>
+      </w:pPr>
+      <w:r>
+        <w:rPr>
+          <w:lang w:val="en-GB"/>
+        </w:rPr>
+        <w:t xml:space="preserve">        HU -&gt; RS         |     0.104321 |       0.56 TWh</w:t>
+      </w:r>
+    </w:p>
+    <w:p>
+      <w:pPr>
+        <w:spacing w:line="240" w:lineRule="auto"/>
+        <w:rPr>
+          <w:highlight w:val="green"/>
+          <w:lang w:val="en-GB"/>
+        </w:rPr>
+      </w:pPr>
+      <w:r>
+        <w:rPr>
+          <w:lang w:val="en-GB"/>
+        </w:rPr>
+        <w:t xml:space="preserve">        </w:t>
+      </w:r>
+      <w:r>
+        <w:rPr>
+          <w:highlight w:val="green"/>
+          <w:lang w:val="en-GB"/>
+        </w:rPr>
+        <w:t>UA -&gt; PL         |     0.094061 |       0.83 TWh</w:t>
+      </w:r>
+    </w:p>
+    <w:p>
+      <w:pPr>
+        <w:spacing w:line="240" w:lineRule="auto"/>
+        <w:rPr>
+          <w:lang w:val="en-GB"/>
+        </w:rPr>
+      </w:pPr>
+      <w:r>
+        <w:rPr>
+          <w:highlight w:val="green"/>
+          <w:lang w:val="en-GB"/>
+        </w:rPr>
+        <w:t xml:space="preserve">        UA -&gt; MD         |     0.086207 |       0.25 TWh</w:t>
+      </w:r>
+    </w:p>
+    <w:p>
+      <w:pPr>
+        <w:spacing w:line="240" w:lineRule="auto"/>
+        <w:rPr>
+          <w:lang w:val="en-GB"/>
+        </w:rPr>
+      </w:pPr>
+      <w:r>
+        <w:rPr>
+          <w:lang w:val="en-GB"/>
+        </w:rPr>
+        <w:t xml:space="preserve">        RO -&gt; BG         |     0.080684 |       1.93 TWh</w:t>
+      </w:r>
+    </w:p>
+    <w:p>
+      <w:pPr>
+        <w:spacing w:line="240" w:lineRule="auto"/>
+        <w:rPr>
+          <w:lang w:val="en-GB"/>
+        </w:rPr>
+      </w:pPr>
+      <w:r>
+        <w:rPr>
+          <w:lang w:val="en-GB"/>
+        </w:rPr>
+        <w:t xml:space="preserve">        HU -&gt; RO         |     0.070709 |       1.54 TWh</w:t>
+      </w:r>
+    </w:p>
+    <w:p>
+      <w:pPr>
+        <w:spacing w:line="240" w:lineRule="auto"/>
+        <w:rPr>
+          <w:lang w:val="en-GB"/>
+        </w:rPr>
+      </w:pPr>
+      <w:r>
+        <w:rPr>
+          <w:lang w:val="en-GB"/>
+        </w:rPr>
+        <w:t xml:space="preserve">        </w:t>
+      </w:r>
+      <w:r>
+        <w:rPr>
+          <w:highlight w:val="green"/>
+          <w:lang w:val="en-GB"/>
+        </w:rPr>
+        <w:t>MD -&gt; UA         |     0.065356 |       0.14 TWh</w:t>
+      </w:r>
+    </w:p>
+    <w:p>
+      <w:pPr>
+        <w:spacing w:line="240" w:lineRule="auto"/>
+        <w:rPr>
+          <w:lang w:val="en-GB"/>
+        </w:rPr>
+      </w:pPr>
+    </w:p>
+    <w:p>
+      <w:pPr>
+        <w:spacing w:line="240" w:lineRule="auto"/>
+        <w:rPr>
+          <w:b/>
+          <w:bCs/>
+          <w:lang w:val="en-GB"/>
+        </w:rPr>
+      </w:pPr>
+      <w:r>
+        <w:rPr>
+          <w:b/>
+          <w:bCs/>
+          <w:lang w:val="en-GB"/>
+        </w:rPr>
+        <w:lastRenderedPageBreak/>
+        <w:t>2022:</w:t>
+      </w:r>
+    </w:p>
+    <w:p>
+      <w:pPr>
+        <w:spacing w:line="240" w:lineRule="auto"/>
+        <w:rPr>
+          <w:lang w:val="en-GB"/>
+        </w:rPr>
+      </w:pPr>
+      <w:r>
+        <w:rPr>
+          <w:lang w:val="en-GB"/>
+        </w:rPr>
+        <w:t xml:space="preserve">        </w:t>
+      </w:r>
+      <w:r>
+        <w:rPr>
+          <w:highlight w:val="green"/>
+          <w:lang w:val="en-GB"/>
+        </w:rPr>
+        <w:t>RO -&gt; UA         |     0.127367 |       0.12 TWh</w:t>
+      </w:r>
+    </w:p>
+    <w:p>
+      <w:pPr>
+        <w:spacing w:line="240" w:lineRule="auto"/>
+        <w:rPr>
+          <w:lang w:val="en-GB"/>
+        </w:rPr>
+      </w:pPr>
+      <w:r>
+        <w:rPr>
+          <w:lang w:val="en-GB"/>
+        </w:rPr>
+        <w:t xml:space="preserve">        PL -&gt; SK         |     0.119275 |       6.01 TWh</w:t>
+      </w:r>
+    </w:p>
+    <w:p>
+      <w:pPr>
+        <w:spacing w:line="240" w:lineRule="auto"/>
+        <w:rPr>
+          <w:lang w:val="en-GB"/>
+        </w:rPr>
+      </w:pPr>
+      <w:r>
+        <w:rPr>
+          <w:lang w:val="en-GB"/>
+        </w:rPr>
+        <w:t xml:space="preserve">        </w:t>
+      </w:r>
+      <w:r>
+        <w:rPr>
+          <w:highlight w:val="green"/>
+          <w:lang w:val="en-GB"/>
+        </w:rPr>
+        <w:t>UA -&gt; PL         |     0.118845 |       1.13 TWh</w:t>
+      </w:r>
+    </w:p>
+    <w:p>
+      <w:pPr>
+        <w:spacing w:line="240" w:lineRule="auto"/>
+        <w:rPr>
+          <w:lang w:val="en-GB"/>
+        </w:rPr>
+      </w:pPr>
+      <w:r>
+        <w:rPr>
+          <w:lang w:val="en-GB"/>
+        </w:rPr>
+        <w:t xml:space="preserve">        SK -&gt; HU         |     0.082429 |      13.20 TWh</w:t>
+      </w:r>
+    </w:p>
+    <w:p>
+      <w:pPr>
+        <w:spacing w:line="240" w:lineRule="auto"/>
+        <w:rPr>
+          <w:lang w:val="en-GB"/>
+        </w:rPr>
+      </w:pPr>
+      <w:r>
+        <w:rPr>
+          <w:lang w:val="en-GB"/>
+        </w:rPr>
+        <w:t xml:space="preserve">        BG -&gt; RO         |     0.079356 |       6.44 TWh</w:t>
+      </w:r>
+    </w:p>
+    <w:p>
+      <w:pPr>
+        <w:spacing w:line="240" w:lineRule="auto"/>
+        <w:rPr>
+          <w:lang w:val="en-GB"/>
+        </w:rPr>
+      </w:pPr>
+      <w:r>
+        <w:rPr>
+          <w:lang w:val="en-GB"/>
+        </w:rPr>
+        <w:t xml:space="preserve">        RS -&gt; RO         |     0.078914 |       0.23 TWh</w:t>
+      </w:r>
+    </w:p>
+    <w:p>
+      <w:pPr>
+        <w:spacing w:line="240" w:lineRule="auto"/>
+        <w:rPr>
+          <w:lang w:val="en-GB"/>
+        </w:rPr>
+      </w:pPr>
+      <w:r>
+        <w:rPr>
+          <w:lang w:val="en-GB"/>
+        </w:rPr>
+        <w:t xml:space="preserve">        GE -&gt; TR         |     0.078504 |       4.03 TWh</w:t>
+      </w:r>
+    </w:p>
+    <w:p>
+      <w:pPr>
+        <w:spacing w:line="240" w:lineRule="auto"/>
+        <w:rPr>
+          <w:lang w:val="en-GB"/>
+        </w:rPr>
+      </w:pPr>
+      <w:r>
+        <w:rPr>
+          <w:lang w:val="en-GB"/>
+        </w:rPr>
+        <w:t xml:space="preserve">        HU -&gt; RS         |     0.078278 |       0.74 TWh</w:t>
+      </w:r>
+    </w:p>
+    <w:p>
+      <w:pPr>
+        <w:spacing w:line="240" w:lineRule="auto"/>
+        <w:rPr>
+          <w:lang w:val="en-GB"/>
+        </w:rPr>
+      </w:pPr>
+    </w:p>
+    <w:p>
+      <w:pPr>
+        <w:spacing w:line="240" w:lineRule="auto"/>
+        <w:rPr>
+          <w:b/>
+          <w:bCs/>
+          <w:lang w:val="en-GB"/>
+        </w:rPr>
+      </w:pPr>
+      <w:r>
+        <w:rPr>
+          <w:b/>
+          <w:bCs/>
+          <w:lang w:val="en-GB"/>
+        </w:rPr>
+        <w:t>2023:</w:t>
+      </w:r>
+    </w:p>
+    <w:p>
+      <w:pPr>
+        <w:spacing w:line="240" w:lineRule="auto"/>
+        <w:rPr>
+          <w:lang w:val="en-GB"/>
+        </w:rPr>
+      </w:pPr>
+      <w:r>
+        <w:rPr>
+          <w:lang w:val="en-GB"/>
+        </w:rPr>
+        <w:t xml:space="preserve">        </w:t>
+      </w:r>
+      <w:r>
+        <w:rPr>
+          <w:lang w:val="en-GB"/>
+        </w:rPr>
+        <w:t>GE -&gt; TR         |     0.119540 |       4.64 TWh</w:t>
+      </w:r>
+    </w:p>
+    <w:p>
+      <w:pPr>
+        <w:spacing w:line="240" w:lineRule="auto"/>
+        <w:rPr>
+          <w:lang w:val="en-GB"/>
+        </w:rPr>
+      </w:pPr>
+      <w:r>
+        <w:rPr>
+          <w:lang w:val="en-GB"/>
+        </w:rPr>
+        <w:t xml:space="preserve">        TR -&gt; BG         |     0.114943 |       0.34 TWh</w:t>
+      </w:r>
+    </w:p>
+    <w:p>
+      <w:pPr>
+        <w:spacing w:line="240" w:lineRule="auto"/>
+        <w:rPr>
+          <w:lang w:val="en-GB"/>
+        </w:rPr>
+      </w:pPr>
+      <w:r>
+        <w:rPr>
+          <w:lang w:val="en-GB"/>
+        </w:rPr>
+        <w:t xml:space="preserve">        BG -&gt; RO         |     0.102957 |       0.96 TWh</w:t>
+      </w:r>
+    </w:p>
+    <w:p>
+      <w:pPr>
+        <w:spacing w:line="240" w:lineRule="auto"/>
+        <w:rPr>
+          <w:lang w:val="en-GB"/>
+        </w:rPr>
+      </w:pPr>
+      <w:r>
+        <w:rPr>
+          <w:lang w:val="en-GB"/>
+        </w:rPr>
+        <w:t xml:space="preserve">    </w:t>
+      </w:r>
+      <w:r>
+        <w:rPr>
+          <w:highlight w:val="green"/>
+          <w:lang w:val="en-GB"/>
+        </w:rPr>
+        <w:t>UA-IPS -&gt; PL         |     0.079169 |       0.64 TWh</w:t>
+      </w:r>
+    </w:p>
+    <w:p>
+      <w:pPr>
+        <w:spacing w:line="240" w:lineRule="auto"/>
+        <w:rPr>
+          <w:lang w:val="en-GB"/>
+        </w:rPr>
+      </w:pPr>
+      <w:r>
+        <w:rPr>
+          <w:lang w:val="en-GB"/>
+        </w:rPr>
+        <w:t xml:space="preserve">        RS -&gt; HU         |     0.074953 |       1.02 TWh</w:t>
+      </w:r>
+    </w:p>
+    <w:p>
+      <w:pPr>
+        <w:spacing w:line="240" w:lineRule="auto"/>
+        <w:rPr>
+          <w:lang w:val="en-GB"/>
+        </w:rPr>
+      </w:pPr>
+      <w:r>
+        <w:rPr>
+          <w:lang w:val="en-GB"/>
+        </w:rPr>
+        <w:t xml:space="preserve">        </w:t>
+      </w:r>
+      <w:r>
+        <w:rPr>
+          <w:highlight w:val="green"/>
+          <w:lang w:val="en-GB"/>
+        </w:rPr>
+        <w:t>RO -&gt; UA-IPS     |     0.070512 |       0.51 TWh</w:t>
+      </w:r>
+    </w:p>
+    <w:p>
+      <w:pPr>
+        <w:spacing w:line="240" w:lineRule="auto"/>
+        <w:rPr>
+          <w:lang w:val="en-GB"/>
+        </w:rPr>
+      </w:pPr>
+      <w:r>
+        <w:rPr>
+          <w:lang w:val="en-GB"/>
+        </w:rPr>
+        <w:t xml:space="preserve">        HU -&gt; RS         |     0.069811 |       0.60 TWh</w:t>
+      </w:r>
+    </w:p>
+    <w:p>
+      <w:pPr>
+        <w:spacing w:line="240" w:lineRule="auto"/>
+        <w:rPr>
+          <w:lang w:val="en-GB"/>
+        </w:rPr>
+      </w:pPr>
+      <w:r>
+        <w:rPr>
+          <w:lang w:val="en-GB"/>
+        </w:rPr>
+        <w:t xml:space="preserve">        </w:t>
+      </w:r>
+      <w:r>
+        <w:rPr>
+          <w:highlight w:val="green"/>
+          <w:lang w:val="en-GB"/>
+        </w:rPr>
+        <w:t>PL -&gt; UA-IPS     |     0.059815 |       0.59 TWh</w:t>
+      </w:r>
+    </w:p>
+    <w:p>
+      <w:pPr>
+        <w:spacing w:line="240" w:lineRule="auto"/>
+        <w:rPr>
+          <w:b/>
+          <w:bCs/>
+          <w:lang w:val="en-GB"/>
+        </w:rPr>
+      </w:pPr>
+      <w:r>
+        <w:rPr>
+          <w:b/>
+          <w:bCs/>
+          <w:lang w:val="en-GB"/>
+        </w:rPr>
+        <w:t>2024:</w:t>
+      </w:r>
+    </w:p>
+    <w:p>
+      <w:pPr>
+        <w:spacing w:line="240" w:lineRule="auto"/>
+        <w:rPr>
+          <w:lang w:val="en-GB"/>
+        </w:rPr>
+      </w:pPr>
+      <w:r>
+        <w:rPr>
+          <w:lang w:val="en-GB"/>
+        </w:rPr>
+        <w:t xml:space="preserve">        </w:t>
+      </w:r>
+      <w:r>
+        <w:rPr>
+          <w:lang w:val="en-GB"/>
+        </w:rPr>
+        <w:t>BG -&gt; RO         |     0.092879 |       1.84 TWh</w:t>
+      </w:r>
+    </w:p>
+    <w:p>
+      <w:pPr>
+        <w:spacing w:line="240" w:lineRule="auto"/>
+        <w:rPr>
+          <w:lang w:val="en-GB"/>
+        </w:rPr>
+      </w:pPr>
+      <w:r>
+        <w:rPr>
+          <w:lang w:val="en-GB"/>
+        </w:rPr>
+        <w:t xml:space="preserve">        TR -&gt; BG         |     0.091954 |       0.99 TWh</w:t>
+      </w:r>
+    </w:p>
+    <w:p>
+      <w:pPr>
+        <w:spacing w:line="240" w:lineRule="auto"/>
+        <w:rPr>
+          <w:lang w:val="en-GB"/>
+        </w:rPr>
+      </w:pPr>
+      <w:r>
+        <w:rPr>
+          <w:lang w:val="en-GB"/>
+        </w:rPr>
+        <w:t xml:space="preserve">        GE -&gt; TR         |     0.089655 |       1.74 TWh</w:t>
+      </w:r>
+    </w:p>
+    <w:p>
+      <w:pPr>
+        <w:spacing w:line="240" w:lineRule="auto"/>
+        <w:rPr>
+          <w:lang w:val="en-GB"/>
+        </w:rPr>
+      </w:pPr>
+      <w:r>
+        <w:rPr>
+          <w:lang w:val="en-GB"/>
+        </w:rPr>
+        <w:t xml:space="preserve">        RS -&gt; HU         |     0.079578 |       0.77 TWh</w:t>
+      </w:r>
+    </w:p>
+    <w:p>
+      <w:pPr>
+        <w:spacing w:line="240" w:lineRule="auto"/>
+        <w:rPr>
+          <w:lang w:val="en-GB"/>
+        </w:rPr>
+      </w:pPr>
+      <w:r>
+        <w:rPr>
+          <w:lang w:val="en-GB"/>
+        </w:rPr>
+        <w:t xml:space="preserve">        HU -&gt; RS         |     0.072107 |       0.82 TWh</w:t>
+      </w:r>
+    </w:p>
+    <w:p>
+      <w:pPr>
+        <w:spacing w:line="240" w:lineRule="auto"/>
+        <w:rPr>
+          <w:lang w:val="en-GB"/>
+        </w:rPr>
+      </w:pPr>
+      <w:r>
+        <w:rPr>
+          <w:lang w:val="en-GB"/>
+        </w:rPr>
+        <w:t xml:space="preserve">        RO -&gt; BG         |     0.054373 |       2.67 TWh</w:t>
+      </w:r>
+    </w:p>
+    <w:p>
+      <w:pPr>
+        <w:spacing w:line="240" w:lineRule="auto"/>
+        <w:rPr>
+          <w:lang w:val="en-GB"/>
+        </w:rPr>
+      </w:pPr>
+      <w:r>
+        <w:rPr>
+          <w:lang w:val="en-GB"/>
+        </w:rPr>
+        <w:t xml:space="preserve">        RS -&gt; ME         |     0.049947 |       1.26 TWh</w:t>
+      </w:r>
+    </w:p>
+    <w:p>
+      <w:pPr>
+        <w:spacing w:line="240" w:lineRule="auto"/>
+        <w:rPr>
+          <w:lang w:val="en-GB"/>
+        </w:rPr>
+      </w:pPr>
+      <w:r>
+        <w:rPr>
+          <w:lang w:val="en-GB"/>
+        </w:rPr>
+        <w:t xml:space="preserve">        BG -&gt; RS         |     0.049502 |       2.25 TWh</w:t>
+      </w:r>
+    </w:p>
+    <w:p>
+      <w:pPr>
+        <w:spacing w:line="240" w:lineRule="auto"/>
+        <w:rPr>
+          <w:lang w:val="en-GB"/>
+        </w:rPr>
+      </w:pPr>
+      <w:r>
+        <w:rPr>
+          <w:lang w:val="en-GB"/>
+        </w:rPr>
+        <w:t xml:space="preserve">        ME -&gt; RS         |     0.046499 |       1.50 TWh</w:t>
+      </w:r>
+    </w:p>
+    <w:p>
+      <w:pPr>
+        <w:spacing w:line="240" w:lineRule="auto"/>
+        <w:rPr>
+          <w:lang w:val="en-GB"/>
+        </w:rPr>
+      </w:pPr>
+      <w:r>
+        <w:rPr>
+          <w:lang w:val="en-GB"/>
+        </w:rPr>
+        <w:t xml:space="preserve">    UA-IPS -&gt; PL         |     0.044010 |       0.95 TWh</w:t>
+      </w:r>
     </w:p>
     <w:sectPr>
       <w:pgSz w:w="11906" w:h="16838"/>

</xml_diff>